<commit_message>
docs(demo 17/10): mục 1c đã đáp ứng (ghi âm cuộc họp PKĐK, Nhà thuốc thành văn bản, Thông báo kết luận)
Co-Authored-By: Claude Opus 5.5 <noreply@anthropic.com>
</commit_message>
<xml_diff>
--- a/30-Ket-Qua/2026-10-16/Soan-Thao/BC_Danh-gia-dap-ung-nhu-cau-ung-dung-AI-Dang-uy-UBND-tinh_20261016_v1.docx
+++ b/30-Ket-Qua/2026-10-16/Soan-Thao/BC_Danh-gia-dap-ung-nhu-cau-ung-dung-AI-Dang-uy-UBND-tinh_20261016_v1.docx
@@ -597,7 +597,7 @@
           <w:sz w:val="28"/>
           <w:szCs w:val="28"/>
         </w:rPr>
-        <w:t xml:space="preserve">Kết quả đối chiếu 21 nội dung theo 04 mức: 12 nội dung đã có công cụ, trình diễn được; 07 nội dung đã có công cụ tương tự, cần điều chỉnh; 01 nội dung cần xây dựng mới; 01 nội dung chưa đáp ứng bằng công cụ hiện có. Chi tiết tại bảng dưới đây.</w:t>
+        <w:t xml:space="preserve">Kết quả đối chiếu 21 nội dung theo 04 mức: 13 nội dung đã có công cụ, trình diễn được; 07 nội dung đã có công cụ tương tự, cần điều chỉnh; 01 nội dung cần xây dựng mới. Chi tiết tại bảng dưới đây.</w:t>
       </w:r>
     </w:p>
     <w:p>
@@ -1629,7 +1629,7 @@
                 <w:szCs w:val="26"/>
                 <w:b w:val="0"/>
               </w:rPr>
-              <w:t xml:space="preserve">Chưa đáp ứng bằng công cụ hiện có</w:t>
+              <w:t xml:space="preserve">Đã có, trình diễn được</w:t>
             </w:r>
           </w:p>
         </w:tc>
@@ -1656,7 +1656,7 @@
                 <w:szCs w:val="26"/>
                 <w:b w:val="0"/>
               </w:rPr>
-              <w:t xml:space="preserve">Gói Claude AI Team không chuyển giọng nói thành văn bản</w:t>
+              <w:t xml:space="preserve">Đã thực hiện: Chuyển ghi âm cuộc họp Phòng khám đa khoa và Nhà thuốc thành văn bản</w:t>
             </w:r>
           </w:p>
         </w:tc>
@@ -1683,7 +1683,7 @@
                 <w:szCs w:val="26"/>
                 <w:b w:val="0"/>
               </w:rPr>
-              <w:t xml:space="preserve">Dùng công cụ nhận dạng giọng nói riêng (được phép, có bảo mật), sau đó AI xử lý văn bản</w:t>
+              <w:t xml:space="preserve">Chỉ với cuộc họp được phép ghi âm; chất lượng phụ thuộc bản ghi âm; cán bộ đối chiếu lại</w:t>
             </w:r>
           </w:p>
         </w:tc>
@@ -1797,9 +1797,7 @@
                 <w:szCs w:val="26"/>
                 <w:b w:val="0"/>
               </w:rPr>
-              <w:t xml:space="preserve">Phòng TH</w:t>
-              <w:noBreakHyphen/>
-              <w:t xml:space="preserve">HC&amp;QT đã dự thảo Thông báo kết luận giao ban tuần bằng AI (10/2026)</w:t>
+              <w:t xml:space="preserve">Đã thực hiện: Thông báo kết luận cuộc họp Phòng khám đa khoa và Nhà thuốc (từ bản ghi âm); Thông báo kết luận giao ban tuần (10/2026)</w:t>
             </w:r>
           </w:p>
         </w:tc>
@@ -1826,7 +1824,7 @@
                 <w:szCs w:val="26"/>
                 <w:b w:val="0"/>
               </w:rPr>
-              <w:t xml:space="preserve">Đầu vào là ghi chép hoặc bản ghi chữ cuộc họp; cán bộ hoàn thiện trước khi trình</w:t>
+              <w:t xml:space="preserve">Cán bộ rà soát, hoàn thiện trước khi trình lãnh đạo</w:t>
             </w:r>
           </w:p>
         </w:tc>
@@ -4131,7 +4129,7 @@
                 <w:szCs w:val="26"/>
                 <w:b w:val="0"/>
               </w:rPr>
-              <w:t xml:space="preserve">12</w:t>
+              <w:t xml:space="preserve">13</w:t>
             </w:r>
           </w:p>
         </w:tc>
@@ -4158,7 +4156,7 @@
                 <w:szCs w:val="26"/>
                 <w:b w:val="0"/>
               </w:rPr>
-              <w:t xml:space="preserve">57%</w:t>
+              <w:t xml:space="preserve">62%</w:t>
             </w:r>
           </w:p>
         </w:tc>
@@ -4279,93 +4277,6 @@
                 <w:b w:val="0"/>
               </w:rPr>
               <w:t xml:space="preserve">Cần xây dựng mới</w:t>
-            </w:r>
-          </w:p>
-        </w:tc>
-        <w:tc>
-          <w:tcPr>
-            <w:tcW w:w="1814" w:type="dxa"/>
-            <w:vAlign w:val="center"/>
-          </w:tcPr>
-          <w:p>
-            <w:pPr>
-              <w:widowControl w:val="0"/>
-              <w:rPr>
-                <w:rFonts w:asciiTheme="majorHAnsi" w:hAnsiTheme="majorHAnsi" w:cstheme="majorHAnsi"/>
-                <w:sz w:val="26"/>
-                <w:szCs w:val="26"/>
-              </w:rPr>
-              <w:jc w:val="center"/>
-              <w:spacing w:before="40" w:after="40" w:line="240" w:lineRule="auto"/>
-            </w:pPr>
-            <w:r>
-              <w:rPr>
-                <w:rFonts w:asciiTheme="majorHAnsi" w:hAnsiTheme="majorHAnsi" w:cstheme="majorHAnsi"/>
-                <w:sz w:val="26"/>
-                <w:szCs w:val="26"/>
-                <w:b w:val="0"/>
-              </w:rPr>
-              <w:t xml:space="preserve">01</w:t>
-            </w:r>
-          </w:p>
-        </w:tc>
-        <w:tc>
-          <w:tcPr>
-            <w:tcW w:w="1814" w:type="dxa"/>
-            <w:vAlign w:val="center"/>
-          </w:tcPr>
-          <w:p>
-            <w:pPr>
-              <w:widowControl w:val="0"/>
-              <w:rPr>
-                <w:rFonts w:asciiTheme="majorHAnsi" w:hAnsiTheme="majorHAnsi" w:cstheme="majorHAnsi"/>
-                <w:sz w:val="26"/>
-                <w:szCs w:val="26"/>
-              </w:rPr>
-              <w:jc w:val="center"/>
-              <w:spacing w:before="40" w:after="40" w:line="240" w:lineRule="auto"/>
-            </w:pPr>
-            <w:r>
-              <w:rPr>
-                <w:rFonts w:asciiTheme="majorHAnsi" w:hAnsiTheme="majorHAnsi" w:cstheme="majorHAnsi"/>
-                <w:sz w:val="26"/>
-                <w:szCs w:val="26"/>
-                <w:b w:val="0"/>
-              </w:rPr>
-              <w:t xml:space="preserve">5%</w:t>
-            </w:r>
-          </w:p>
-        </w:tc>
-      </w:tr>
-      <w:tr>
-        <w:trPr>
-          <w:jc w:val="center"/>
-          <w:cantSplit/>
-        </w:trPr>
-        <w:tc>
-          <w:tcPr>
-            <w:tcW w:w="5442" w:type="dxa"/>
-            <w:vAlign w:val="center"/>
-          </w:tcPr>
-          <w:p>
-            <w:pPr>
-              <w:widowControl w:val="0"/>
-              <w:rPr>
-                <w:rFonts w:asciiTheme="majorHAnsi" w:hAnsiTheme="majorHAnsi" w:cstheme="majorHAnsi"/>
-                <w:sz w:val="26"/>
-                <w:szCs w:val="26"/>
-              </w:rPr>
-              <w:jc w:val="left"/>
-              <w:spacing w:before="40" w:after="40" w:line="240" w:lineRule="auto"/>
-            </w:pPr>
-            <w:r>
-              <w:rPr>
-                <w:rFonts w:asciiTheme="majorHAnsi" w:hAnsiTheme="majorHAnsi" w:cstheme="majorHAnsi"/>
-                <w:sz w:val="26"/>
-                <w:szCs w:val="26"/>
-                <w:b w:val="0"/>
-              </w:rPr>
-              <w:t xml:space="preserve">Chưa đáp ứng bằng công cụ hiện có</w:t>
             </w:r>
           </w:p>
         </w:tc>
@@ -4606,7 +4517,7 @@
           <w:szCs w:val="28"/>
           <w:shd w:val="clear" w:color="auto" w:fill="FFFFFF"/>
         </w:rPr>
-        <w:t xml:space="preserve">- Nói rõ nội dung chưa đáp ứng (chuyển ghi âm thành văn bản) và nội dung cần xây dựng mới (phân loại đơn thư), không hứa trình diễn các nội dung này.</w:t>
+        <w:t xml:space="preserve">- Mục 1c có thể giới thiệu kết quả thật: Thông báo kết luận cuộc họp Phòng khám đa khoa và Nhà thuốc được dự thảo từ bản ghi âm. Nói rõ nội dung cần xây dựng mới (phân loại đơn thư), không hứa trình diễn nội dung này.</w:t>
       </w:r>
     </w:p>
     <w:p>

</xml_diff>